<commit_message>
Piano di test: item live per M11 (turn-in) e M9/M14 (soglie per-classe)
Aggiornato HONE_Test_Plan_AC_ACC.docx con le validazioni live rimaste dopo
questa sessione, pronte da compilare:
- B3/B4 rivisti: soglia spin ora per-classe; nota sul filtro turn-in.
- B8 (nuovo): sottosterzo NON al turn-in (M11) — come provocarlo, atteso,
  e come regolare _TURNIN_RATE.
- B9 (nuovo): banda velocità curva per-classe (M14) — verifica etichette
  lento/veloce e speed_split_kmh.
- G6 (nuovo): Andamento → Gomme nel tempo (grafici temp/pressione per ruota).
- G7 (nuovo): Confronto → mini-mappa hover + orario nei selettori giro.
- Conteggio test automatici 356 → 386.

Co-Authored-By: Claude Opus 4.8 <noreply@anthropic.com>
Claude-Session: https://claude.ai/code/session_01W77yUPq91fKznsabKhS9SC
</commit_message>
<xml_diff>
--- a/HONE_Test_Plan_AC_ACC.docx
+++ b/HONE_Test_Plan_AC_ACC.docx
@@ -35,7 +35,7 @@
         <w:t xml:space="preserve">A cosa serve. </w:t>
       </w:r>
       <w:r>
-        <w:t>Tutta la logica è coperta da 356 test automatici, ma alcune cose si possono validare solo col gioco e uno schermo: rendering dell'overlay, voce, pagina Ingegnere live (WebSocket), e soprattutto la TARATURA delle soglie dei cue su telemetria reale per le tre classi (GT3, Formula, Stradali). Questo documento elenca i test da condurre, con come farli e cosa aspettarsi. Segna l'esito su ciascuno.</w:t>
+        <w:t>Tutta la logica è coperta da 386 test automatici, ma alcune cose si possono validare solo col gioco e uno schermo: rendering dell'overlay, voce, pagina Ingegnere live (WebSocket), e soprattutto la TARATURA delle soglie dei cue su telemetria reale per le tre classi (GT3, Formula, Stradali). Questo documento elenca i test da condurre, con come farli e cosa aspettarsi. Segna l'esito su ciascuno.</w:t>
       </w:r>
     </w:p>
     <w:p>
@@ -550,7 +550,7 @@
         <w:t xml:space="preserve">Atteso: </w:t>
       </w:r>
       <w:r>
-        <w:t>Cue 'Pattini in uscita'. Verifica che NON spari falsi positivi a regime su GT3/Formula (soglia spin oggi globale 0.10 — candidato a per-classe Road 0.12 / GT3 0.13 / Formula 0.15).</w:t>
+        <w:t>Cue ‘Pattini in uscita’. La soglia di pattinamento è ora PER-CLASSE (Road 0.12 / GT3 0.13 / Formula 0.15, in coaching/tuning.py): verifica che a regime su GT3/Formula NON spari falsi positivi e che catturi comunque un pattinamento vero. Se sbaglia, ritocca i valori nella tabella.</w:t>
       </w:r>
     </w:p>
     <w:p>
@@ -597,7 +597,7 @@
         <w:t xml:space="preserve">Atteso: </w:t>
       </w:r>
       <w:r>
-        <w:t>I cue corrispondono al comportamento; sulle Formula valuta se la soglia understeer assoluta (0.9) è adeguata o serve baseline relativa.</w:t>
+        <w:t>I cue corrispondono al comportamento. Il falso sottosterzo al TURN-IN è ora filtrato (lo yaw ritarda sullo sterzo): in inserimento pulito NON deve scattare ‘L’anteriore scivola’, ma un push vero a metà curva sì. Sulle Formula valuta se la soglia understeer assoluta (0.9) è adeguata o serve baseline relativa.</w:t>
       </w:r>
     </w:p>
     <w:p>
@@ -753,6 +753,76 @@
       </w:r>
     </w:p>
     <w:p>
+      <w:r>
+        <w:rPr>
+          <w:b/>
+        </w:rPr>
+        <w:t>B8. Sottosterzo NON al turn-in (M11)</w:t>
+      </w:r>
+    </w:p>
+    <w:p>
+      <w:r>
+        <w:rPr>
+          <w:b/>
+        </w:rPr>
+        <w:t xml:space="preserve">Come: </w:t>
+      </w:r>
+      <w:r>
+        <w:t>Entra in curva avvitando lo sterzo in modo deciso su un’auto bilanciata (nessun sottosterzo reale), per classe. Poi provoca un sottosterzo vero tenendo lo sterzo fermo a metà curva con l’anteriore che scivola.</w:t>
+      </w:r>
+    </w:p>
+    <w:p>
+      <w:r>
+        <w:rPr>
+          <w:b/>
+        </w:rPr>
+        <w:t xml:space="preserve">Atteso: </w:t>
+      </w:r>
+      <w:r>
+        <w:t>Durante l’inserimento (sterzo che sale) NON parte ‘L’anteriore scivola’ — è il transitorio, lo yaw è in ritardo. A sterzo assestato con l’auto che non ruota, il cue arriva. Se scatta ancora in inserimento alza _TURNIN_RATE (oggi 0.6 rad/s) in coaching/balance.py; se un push lento non viene mai chiamato, abbassalo.</w:t>
+      </w:r>
+    </w:p>
+    <w:p>
+      <w:r>
+        <w:t>Esito:  ☐ OK   ☐ KO   — note: ______________________________</w:t>
+      </w:r>
+    </w:p>
+    <w:p>
+      <w:r>
+        <w:rPr>
+          <w:b/>
+        </w:rPr>
+        <w:t>B9. Banda velocità curva per classe (M14)</w:t>
+      </w:r>
+    </w:p>
+    <w:p>
+      <w:r>
+        <w:rPr>
+          <w:b/>
+        </w:rPr>
+        <w:t xml:space="preserve">Come: </w:t>
+      </w:r>
+      <w:r>
+        <w:t>Guida un giro per classe e apri il debrief (app Analisi) o l’Ingegnere; osserva come le curve vengono trattate come lente/veloci nella diagnosi.</w:t>
+      </w:r>
+    </w:p>
+    <w:p>
+      <w:r>
+        <w:rPr>
+          <w:b/>
+        </w:rPr>
+        <w:t xml:space="preserve">Atteso: </w:t>
+      </w:r>
+      <w:r>
+        <w:t>La soglia lento/veloce è per-classe (Road 100 / GT3 120 / Formula 140 km/h, in coaching/tuning.py): la curva ‘lenta’ di una Formula non deve essere classificata come su una stradale. Se le classificazioni non convincono, regola speed_split_kmh.</w:t>
+      </w:r>
+    </w:p>
+    <w:p>
+      <w:r>
+        <w:t>Esito:  ☐ OK   ☐ KO   — note: ______________________________</w:t>
+      </w:r>
+    </w:p>
+    <w:p>
       <w:pPr>
         <w:pStyle w:val="Heading1"/>
       </w:pPr>
@@ -2026,6 +2096,76 @@
         <w:rPr>
           <w:color w:val="666666"/>
         </w:rPr>
+        <w:t>Esito:  ☐ OK   ☐ KO   — note: ______________________________</w:t>
+      </w:r>
+    </w:p>
+    <w:p>
+      <w:r>
+        <w:rPr>
+          <w:b/>
+        </w:rPr>
+        <w:t>G6. Andamento — Gomme nel tempo</w:t>
+      </w:r>
+    </w:p>
+    <w:p>
+      <w:r>
+        <w:rPr>
+          <w:b/>
+        </w:rPr>
+        <w:t xml:space="preserve">Come: </w:t>
+      </w:r>
+      <w:r>
+        <w:t>Con più giri registrati (gomme in temperatura), apri l’app di Analisi → tab Andamento.</w:t>
+      </w:r>
+    </w:p>
+    <w:p>
+      <w:r>
+        <w:rPr>
+          <w:b/>
+        </w:rPr>
+        <w:t xml:space="preserve">Atteso: </w:t>
+      </w:r>
+      <w:r>
+        <w:t>Compare la sezione ‘Gomme nel tempo’: due grafici (temperatura mescola e pressione) con una linea per ruota lungo lo stint (ant. ciano / post. ambra, pieno = sinistra / tratteggio = destra) più il riepilogo del drift per asse dal primo all’ultimo giro. Su giri vecchi senza dati per-ruota la sezione resta nascosta.</w:t>
+      </w:r>
+    </w:p>
+    <w:p>
+      <w:r>
+        <w:t>Esito:  ☐ OK   ☐ KO   — note: ______________________________</w:t>
+      </w:r>
+    </w:p>
+    <w:p>
+      <w:r>
+        <w:rPr>
+          <w:b/>
+        </w:rPr>
+        <w:t>G7. Confronto — mini-mappa e orario nei selettori</w:t>
+      </w:r>
+    </w:p>
+    <w:p>
+      <w:r>
+        <w:rPr>
+          <w:b/>
+        </w:rPr>
+        <w:t xml:space="preserve">Come: </w:t>
+      </w:r>
+      <w:r>
+        <w:t>Tab Confronto: passa il mouse sui grafici; apri i menu ‘Giro da rivedere’ e ‘Confronta con’.</w:t>
+      </w:r>
+    </w:p>
+    <w:p>
+      <w:r>
+        <w:rPr>
+          <w:b/>
+        </w:rPr>
+        <w:t xml:space="preserve">Atteso: </w:t>
+      </w:r>
+      <w:r>
+        <w:t>La mini-mappa sopra i grafici evidenzia lo stesso punto quando passi il mouse (e viceversa: muovendoti sulla mini-mappa si spostano i mirini dei grafici); i menu mostrano ★ per il migliore, [PRO] per i riferimenti e l’orario (HH:MM) per distinguere giri con lo stesso tempo.</w:t>
+      </w:r>
+    </w:p>
+    <w:p>
+      <w:r>
         <w:t>Esito:  ☐ OK   ☐ KO   — note: ______________________________</w:t>
       </w:r>
     </w:p>

</xml_diff>